<commit_message>
fix: align pom properties and environment settings
</commit_message>
<xml_diff>
--- a/reports/Group/D01/00 - Identification Form.docx
+++ b/reports/Group/D01/00 - Identification Form.docx
@@ -488,7 +488,6 @@
                   <w:docPart w:val="86462A3115F240619C10F4371A2E6A3E"/>
                 </w:placeholder>
               </w:sdtPr>
-              <w:sdtEndPr/>
               <w:sdtContent>
                 <w:r>
                   <w:rPr>
@@ -496,7 +495,7 @@
                     <w:i/>
                     <w:iCs/>
                   </w:rPr>
-                  <w:t>DP2-G021/Acme-Starters-C-26.1.0.git</w:t>
+                  <w:t>DP2-G021/Acme-Starters-C-26.1.0</w:t>
                 </w:r>
               </w:sdtContent>
             </w:sdt>
@@ -625,7 +624,6 @@
               <w:docPart w:val="87A87B68081E4C51824181939A8312B9"/>
             </w:placeholder>
           </w:sdtPr>
-          <w:sdtEndPr/>
           <w:sdtContent>
             <w:tc>
               <w:tcPr>
@@ -702,7 +700,6 @@
               <w:docPart w:val="6EEE99372F0D4FB5A03EB0BDF6AF76C7"/>
             </w:placeholder>
           </w:sdtPr>
-          <w:sdtEndPr/>
           <w:sdtContent>
             <w:tc>
               <w:tcPr>
@@ -788,7 +785,6 @@
               <w:docPart w:val="A62D95033FBF4F108A16844BF9735A65"/>
             </w:placeholder>
           </w:sdtPr>
-          <w:sdtEndPr/>
           <w:sdtContent>
             <w:tc>
               <w:tcPr>
@@ -869,7 +865,6 @@
               <w:docPart w:val="82942A0EA77541EF928400BF197CB291"/>
             </w:placeholder>
           </w:sdtPr>
-          <w:sdtEndPr/>
           <w:sdtContent>
             <w:tc>
               <w:tcPr>
@@ -953,7 +948,6 @@
               <w:docPart w:val="4837284C9B7146B5BB29B30A3C2E7BEE"/>
             </w:placeholder>
           </w:sdtPr>
-          <w:sdtEndPr/>
           <w:sdtContent>
             <w:tc>
               <w:tcPr>
@@ -1034,7 +1028,6 @@
               <w:docPart w:val="1D4305A9657A4581875BF2F5A67E0B98"/>
             </w:placeholder>
           </w:sdtPr>
-          <w:sdtEndPr/>
           <w:sdtContent>
             <w:tc>
               <w:tcPr>
@@ -1140,7 +1133,6 @@
               <w:docPart w:val="27F083CF046A479A942F2167561315DF"/>
             </w:placeholder>
           </w:sdtPr>
-          <w:sdtEndPr/>
           <w:sdtContent>
             <w:tc>
               <w:tcPr>
@@ -1168,6 +1160,16 @@
                   </w:rPr>
                   <w:t>Operator, Developer</w:t>
                 </w:r>
+                <w:r>
+                  <w:rPr>
+                    <w:rFonts w:asciiTheme="majorHAnsi" w:eastAsia="Calibri" w:hAnsiTheme="majorHAnsi" w:cstheme="majorHAnsi"/>
+                    <w:i/>
+                    <w:iCs/>
+                    <w:sz w:val="22"/>
+                    <w:szCs w:val="22"/>
+                  </w:rPr>
+                  <w:t>, Tester</w:t>
+                </w:r>
               </w:p>
             </w:tc>
           </w:sdtContent>
@@ -1241,7 +1243,6 @@
               <w:docPart w:val="4AB32200232041A5AAE9D047CBEFE3E7"/>
             </w:placeholder>
           </w:sdtPr>
-          <w:sdtEndPr/>
           <w:sdtContent>
             <w:tc>
               <w:tcPr>
@@ -1269,6 +1270,16 @@
                   </w:rPr>
                   <w:t>Operator, Developer</w:t>
                 </w:r>
+                <w:r>
+                  <w:rPr>
+                    <w:rFonts w:asciiTheme="majorHAnsi" w:eastAsia="Calibri" w:hAnsiTheme="majorHAnsi" w:cstheme="majorHAnsi"/>
+                    <w:i/>
+                    <w:iCs/>
+                    <w:sz w:val="22"/>
+                    <w:szCs w:val="22"/>
+                  </w:rPr>
+                  <w:t>, Tester</w:t>
+                </w:r>
               </w:p>
             </w:tc>
           </w:sdtContent>
@@ -1422,7 +1433,6 @@
               <w:docPart w:val="E4184EB2B82846D7A07AF432567EB729"/>
             </w:placeholder>
           </w:sdtPr>
-          <w:sdtEndPr/>
           <w:sdtContent>
             <w:tc>
               <w:tcPr>
@@ -1503,7 +1513,6 @@
               <w:docPart w:val="9C3834C70B324F36A20F7C13B3AFF426"/>
             </w:placeholder>
           </w:sdtPr>
-          <w:sdtEndPr/>
           <w:sdtContent>
             <w:tc>
               <w:tcPr>
@@ -1589,7 +1598,6 @@
               <w:docPart w:val="5B7E20A152DE4134B358712663E8E280"/>
             </w:placeholder>
           </w:sdtPr>
-          <w:sdtEndPr/>
           <w:sdtContent>
             <w:tc>
               <w:tcPr>
@@ -1670,7 +1678,6 @@
               <w:docPart w:val="A43B1E456E8B46F592F9E5315EC0C471"/>
             </w:placeholder>
           </w:sdtPr>
-          <w:sdtEndPr/>
           <w:sdtContent>
             <w:tc>
               <w:tcPr>
@@ -1756,7 +1763,6 @@
               <w:docPart w:val="5E8CA8DAB2294B7A8AEC8D2232B7B666"/>
             </w:placeholder>
           </w:sdtPr>
-          <w:sdtEndPr/>
           <w:sdtContent>
             <w:tc>
               <w:tcPr>
@@ -1850,7 +1856,6 @@
               <w:docPart w:val="98DB1037347A459B8BD44C2CA1CBE04F"/>
             </w:placeholder>
           </w:sdtPr>
-          <w:sdtEndPr/>
           <w:sdtContent>
             <w:tc>
               <w:tcPr>
@@ -1957,7 +1962,6 @@
               <w:docPart w:val="18CB4A99D18A43B4AAC70ACDD7B36142"/>
             </w:placeholder>
           </w:sdtPr>
-          <w:sdtEndPr/>
           <w:sdtContent>
             <w:tc>
               <w:tcPr>
@@ -2058,7 +2062,6 @@
               <w:docPart w:val="C707358B35E9460F89E4C0F155AE698F"/>
             </w:placeholder>
           </w:sdtPr>
-          <w:sdtEndPr/>
           <w:sdtContent>
             <w:tc>
               <w:tcPr>
@@ -2096,6 +2099,16 @@
                   </w:rPr>
                   <w:t>, Analyst</w:t>
                 </w:r>
+                <w:r>
+                  <w:rPr>
+                    <w:rFonts w:asciiTheme="majorHAnsi" w:eastAsia="Calibri" w:hAnsiTheme="majorHAnsi" w:cstheme="majorHAnsi"/>
+                    <w:i/>
+                    <w:iCs/>
+                    <w:sz w:val="22"/>
+                    <w:szCs w:val="22"/>
+                  </w:rPr>
+                  <w:t>, Tester</w:t>
+                </w:r>
               </w:p>
             </w:tc>
           </w:sdtContent>
@@ -2218,7 +2231,6 @@
               <w:docPart w:val="07C1E16562F744CDA1108996FDC4506E"/>
             </w:placeholder>
           </w:sdtPr>
-          <w:sdtEndPr/>
           <w:sdtContent>
             <w:tc>
               <w:tcPr>
@@ -2328,7 +2340,6 @@
               <w:docPart w:val="A504451A6B544C7BA821505A41F511E6"/>
             </w:placeholder>
           </w:sdtPr>
-          <w:sdtEndPr/>
           <w:sdtContent>
             <w:tc>
               <w:tcPr>
@@ -2439,7 +2450,6 @@
               <w:docPart w:val="8F785ACB1CB0409098930478E3F27483"/>
             </w:placeholder>
           </w:sdtPr>
-          <w:sdtEndPr/>
           <w:sdtContent>
             <w:tc>
               <w:tcPr>
@@ -2570,7 +2580,6 @@
               <w:docPart w:val="B7591F2B336648E58636ED4C22A5E629"/>
             </w:placeholder>
           </w:sdtPr>
-          <w:sdtEndPr/>
           <w:sdtContent>
             <w:tc>
               <w:tcPr>
@@ -2587,7 +2596,6 @@
                     <w:szCs w:val="22"/>
                   </w:rPr>
                 </w:pPr>
-                <w:proofErr w:type="spellStart"/>
                 <w:r>
                   <w:rPr>
                     <w:rFonts w:asciiTheme="majorHAnsi" w:eastAsia="Calibri" w:hAnsiTheme="majorHAnsi" w:cstheme="majorHAnsi"/>
@@ -2606,9 +2614,8 @@
                     <w:sz w:val="22"/>
                     <w:szCs w:val="22"/>
                   </w:rPr>
-                  <w:t>evelper</w:t>
+                  <w:t>evel</w:t>
                 </w:r>
-                <w:proofErr w:type="spellEnd"/>
                 <w:r>
                   <w:rPr>
                     <w:rFonts w:asciiTheme="majorHAnsi" w:eastAsia="Calibri" w:hAnsiTheme="majorHAnsi" w:cstheme="majorHAnsi"/>
@@ -2617,7 +2624,17 @@
                     <w:sz w:val="22"/>
                     <w:szCs w:val="22"/>
                   </w:rPr>
-                  <w:t xml:space="preserve">, Tester </w:t>
+                  <w:t>o</w:t>
+                </w:r>
+                <w:r>
+                  <w:rPr>
+                    <w:rFonts w:asciiTheme="majorHAnsi" w:eastAsia="Calibri" w:hAnsiTheme="majorHAnsi" w:cstheme="majorHAnsi"/>
+                    <w:i/>
+                    <w:iCs/>
+                    <w:sz w:val="22"/>
+                    <w:szCs w:val="22"/>
+                  </w:rPr>
+                  <w:t xml:space="preserve">per, Tester </w:t>
                 </w:r>
               </w:p>
             </w:tc>
@@ -2722,7 +2739,6 @@
                   <w:docPart w:val="3843AF8B4938474BBDDF97FF967628A8"/>
                 </w:placeholder>
               </w:sdtPr>
-              <w:sdtEndPr/>
               <w:sdtContent>
                 <w:sdt>
                   <w:sdtPr>
@@ -2739,7 +2755,6 @@
                       <w:docPart w:val="3BE406FB9A80473796ECC030D076B605"/>
                     </w:placeholder>
                   </w:sdtPr>
-                  <w:sdtEndPr/>
                   <w:sdtContent>
                     <w:r>
                       <w:rPr>
@@ -2750,31 +2765,7 @@
                         <w:szCs w:val="22"/>
                         <w:lang w:val="es-ES"/>
                       </w:rPr>
-                      <w:t xml:space="preserve">Sevilla </w:t>
-                    </w:r>
-                    <w:proofErr w:type="gramStart"/>
-                    <w:r>
-                      <w:rPr>
-                        <w:rFonts w:asciiTheme="majorHAnsi" w:eastAsia="Calibri Light" w:hAnsiTheme="majorHAnsi" w:cstheme="majorHAnsi"/>
-                        <w:i/>
-                        <w:iCs/>
-                        <w:sz w:val="22"/>
-                        <w:szCs w:val="22"/>
-                        <w:lang w:val="es-ES"/>
-                      </w:rPr>
-                      <w:t>Febrero</w:t>
-                    </w:r>
-                    <w:proofErr w:type="gramEnd"/>
-                    <w:r>
-                      <w:rPr>
-                        <w:rFonts w:asciiTheme="majorHAnsi" w:eastAsia="Calibri Light" w:hAnsiTheme="majorHAnsi" w:cstheme="majorHAnsi"/>
-                        <w:i/>
-                        <w:iCs/>
-                        <w:sz w:val="22"/>
-                        <w:szCs w:val="22"/>
-                        <w:lang w:val="es-ES"/>
-                      </w:rPr>
-                      <w:t xml:space="preserve"> </w:t>
+                      <w:t xml:space="preserve">Sevilla Febrero </w:t>
                     </w:r>
                     <w:r>
                       <w:rPr>
@@ -5546,13 +5537,15 @@
     <w:rsid w:val="00210A8A"/>
     <w:rsid w:val="00212213"/>
     <w:rsid w:val="00213D82"/>
-    <w:rsid w:val="002F1FEB"/>
+    <w:rsid w:val="002E7A91"/>
     <w:rsid w:val="002F6B36"/>
     <w:rsid w:val="00314F21"/>
+    <w:rsid w:val="003E19B7"/>
     <w:rsid w:val="004410FC"/>
     <w:rsid w:val="004A54CF"/>
     <w:rsid w:val="004C28F8"/>
     <w:rsid w:val="0052338B"/>
+    <w:rsid w:val="005A4202"/>
     <w:rsid w:val="00620AAC"/>
     <w:rsid w:val="00743CC5"/>
     <w:rsid w:val="007D11E9"/>
@@ -5570,6 +5563,7 @@
     <w:rsid w:val="00AB68CA"/>
     <w:rsid w:val="00B15BBC"/>
     <w:rsid w:val="00B712D5"/>
+    <w:rsid w:val="00B729FB"/>
     <w:rsid w:val="00B847D5"/>
     <w:rsid w:val="00BA349C"/>
     <w:rsid w:val="00C1468D"/>
@@ -5579,7 +5573,6 @@
     <w:rsid w:val="00DB0C6F"/>
     <w:rsid w:val="00DC6B61"/>
     <w:rsid w:val="00DD76BC"/>
-    <w:rsid w:val="00E468E8"/>
     <w:rsid w:val="00E566B1"/>
     <w:rsid w:val="00E77A2D"/>
   </w:rsids>

</xml_diff>